<commit_message>
Testverslag verwerkt, gameplay verbeterd en documentatie afgerond
</commit_message>
<xml_diff>
--- a/Docs/Game Design Document.docx
+++ b/Docs/Game Design Document.docx
@@ -469,7 +469,7 @@
     </w:p>
     <w:p>
       <w:pPr>
-        <w:pStyle w:val="Kop1"/>
+        <w:pStyle w:val="Heading1"/>
         <w:rPr>
           <w:rFonts w:ascii="Arial" w:eastAsia="Arial" w:hAnsi="Arial" w:cs="Arial"/>
           <w:b/>
@@ -531,7 +531,7 @@
           </w:tcPr>
           <w:p>
             <w:pPr>
-              <w:pStyle w:val="Kop1"/>
+              <w:pStyle w:val="Heading1"/>
               <w:spacing w:before="0" w:after="60" w:line="276" w:lineRule="auto"/>
               <w:rPr>
                 <w:rFonts w:ascii="Roboto Condensed" w:eastAsia="Roboto Condensed" w:hAnsi="Roboto Condensed" w:cs="Roboto Condensed"/>
@@ -571,7 +571,7 @@
           </w:tcPr>
           <w:p>
             <w:pPr>
-              <w:pStyle w:val="Kop2"/>
+              <w:pStyle w:val="Heading2"/>
               <w:widowControl w:val="0"/>
               <w:spacing w:before="0" w:after="60"/>
               <w:rPr>
@@ -1236,7 +1236,7 @@
           </w:tcPr>
           <w:p>
             <w:pPr>
-              <w:pStyle w:val="Kop2"/>
+              <w:pStyle w:val="Heading2"/>
               <w:widowControl w:val="0"/>
               <w:spacing w:before="0" w:after="60"/>
               <w:rPr>
@@ -1825,7 +1825,7 @@
           </w:tcPr>
           <w:p>
             <w:pPr>
-              <w:pStyle w:val="Kop2"/>
+              <w:pStyle w:val="Heading2"/>
               <w:widowControl w:val="0"/>
               <w:spacing w:before="0" w:after="60"/>
               <w:rPr>
@@ -2500,7 +2500,7 @@
           </w:tcPr>
           <w:p>
             <w:pPr>
-              <w:pStyle w:val="Kop2"/>
+              <w:pStyle w:val="Heading2"/>
               <w:widowControl w:val="0"/>
               <w:spacing w:before="0" w:after="60"/>
               <w:rPr>
@@ -3182,7 +3182,7 @@
           </w:tcPr>
           <w:p>
             <w:pPr>
-              <w:pStyle w:val="Kop2"/>
+              <w:pStyle w:val="Heading2"/>
               <w:widowControl w:val="0"/>
               <w:spacing w:before="0" w:after="60"/>
               <w:rPr>
@@ -3342,7 +3342,7 @@
                       <w:sz w:val="22"/>
                       <w:szCs w:val="22"/>
                     </w:rPr>
-                    <w:t>scorer</w:t>
+                    <w:t>score</w:t>
                   </w:r>
                   <w:proofErr w:type="gramEnd"/>
                 </w:p>
@@ -3545,20 +3545,6 @@
                       <w:lang w:val="en-US"/>
                     </w:rPr>
                   </w:pPr>
-                  <w:r>
-                    <w:rPr>
-                      <w:rFonts w:ascii="Cabin" w:eastAsia="Cabin" w:hAnsi="Cabin" w:cs="Cabin"/>
-                      <w:i/>
-                      <w:color w:val="B7B7B7"/>
-                      <w:sz w:val="22"/>
-                      <w:szCs w:val="22"/>
-                      <w:lang w:val="en-US"/>
-                    </w:rPr>
-                    <w:t>.</w:t>
-                  </w:r>
-                  <w:r>
-                    <w:t xml:space="preserve"> </w:t>
-                  </w:r>
                   <w:proofErr w:type="gramStart"/>
                   <w:r>
                     <w:rPr>
@@ -3974,7 +3960,7 @@
           </w:tcPr>
           <w:p>
             <w:pPr>
-              <w:pStyle w:val="Kop2"/>
+              <w:pStyle w:val="Heading2"/>
               <w:widowControl w:val="0"/>
               <w:spacing w:before="0" w:after="60"/>
               <w:rPr>
@@ -4280,7 +4266,7 @@
     </w:p>
     <w:p>
       <w:pPr>
-        <w:pStyle w:val="Kop1"/>
+        <w:pStyle w:val="Heading1"/>
         <w:spacing w:before="0" w:after="60" w:line="276" w:lineRule="auto"/>
         <w:rPr>
           <w:rFonts w:ascii="Roboto Condensed" w:eastAsia="Roboto Condensed" w:hAnsi="Roboto Condensed" w:cs="Roboto Condensed"/>
@@ -4336,7 +4322,7 @@
           </w:tcPr>
           <w:p>
             <w:pPr>
-              <w:pStyle w:val="Kop2"/>
+              <w:pStyle w:val="Heading2"/>
               <w:widowControl w:val="0"/>
               <w:spacing w:before="0" w:after="60"/>
               <w:rPr>
@@ -4371,7 +4357,7 @@
           </w:tcPr>
           <w:p>
             <w:pPr>
-              <w:pStyle w:val="Kop2"/>
+              <w:pStyle w:val="Heading2"/>
               <w:widowControl w:val="0"/>
               <w:spacing w:before="0" w:after="60"/>
               <w:rPr>
@@ -4406,7 +4392,7 @@
           </w:tcPr>
           <w:p>
             <w:pPr>
-              <w:pStyle w:val="Kop2"/>
+              <w:pStyle w:val="Heading2"/>
               <w:widowControl w:val="0"/>
               <w:spacing w:before="0" w:after="60"/>
               <w:rPr>
@@ -4686,37 +4672,15 @@
                       <w:szCs w:val="22"/>
                     </w:rPr>
                   </w:pPr>
-                  <w:proofErr w:type="gramStart"/>
-                  <w:r>
-                    <w:rPr>
-                      <w:rFonts w:ascii="Cabin" w:eastAsia="Cabin" w:hAnsi="Cabin" w:cs="Cabin"/>
-                      <w:i/>
-                      <w:sz w:val="22"/>
-                      <w:szCs w:val="22"/>
-                    </w:rPr>
-                    <w:t>mm</w:t>
-                  </w:r>
-                  <w:proofErr w:type="gramEnd"/>
-                  <w:r>
-                    <w:rPr>
-                      <w:rFonts w:ascii="Cabin" w:eastAsia="Cabin" w:hAnsi="Cabin" w:cs="Cabin"/>
-                      <w:i/>
-                      <w:sz w:val="22"/>
-                      <w:szCs w:val="22"/>
-                    </w:rPr>
-                    <w:t>/</w:t>
-                  </w:r>
-                  <w:proofErr w:type="spellStart"/>
-                  <w:r>
-                    <w:rPr>
-                      <w:rFonts w:ascii="Cabin" w:eastAsia="Cabin" w:hAnsi="Cabin" w:cs="Cabin"/>
-                      <w:i/>
-                      <w:sz w:val="22"/>
-                      <w:szCs w:val="22"/>
-                    </w:rPr>
-                    <w:t>dd</w:t>
-                  </w:r>
-                  <w:proofErr w:type="spellEnd"/>
+                  <w:r>
+                    <w:rPr>
+                      <w:rFonts w:ascii="Cabin" w:eastAsia="Cabin" w:hAnsi="Cabin" w:cs="Cabin"/>
+                      <w:i/>
+                      <w:sz w:val="22"/>
+                      <w:szCs w:val="22"/>
+                    </w:rPr>
+                    <w:t>05/28</w:t>
+                  </w:r>
                 </w:p>
               </w:tc>
             </w:tr>
@@ -4986,37 +4950,15 @@
                       <w:szCs w:val="22"/>
                     </w:rPr>
                   </w:pPr>
-                  <w:proofErr w:type="gramStart"/>
-                  <w:r>
-                    <w:rPr>
-                      <w:rFonts w:ascii="Cabin" w:eastAsia="Cabin" w:hAnsi="Cabin" w:cs="Cabin"/>
-                      <w:i/>
-                      <w:sz w:val="22"/>
-                      <w:szCs w:val="22"/>
-                    </w:rPr>
-                    <w:t>mm</w:t>
-                  </w:r>
-                  <w:proofErr w:type="gramEnd"/>
-                  <w:r>
-                    <w:rPr>
-                      <w:rFonts w:ascii="Cabin" w:eastAsia="Cabin" w:hAnsi="Cabin" w:cs="Cabin"/>
-                      <w:i/>
-                      <w:sz w:val="22"/>
-                      <w:szCs w:val="22"/>
-                    </w:rPr>
-                    <w:t>/</w:t>
-                  </w:r>
-                  <w:proofErr w:type="spellStart"/>
-                  <w:r>
-                    <w:rPr>
-                      <w:rFonts w:ascii="Cabin" w:eastAsia="Cabin" w:hAnsi="Cabin" w:cs="Cabin"/>
-                      <w:i/>
-                      <w:sz w:val="22"/>
-                      <w:szCs w:val="22"/>
-                    </w:rPr>
-                    <w:t>dd</w:t>
-                  </w:r>
-                  <w:proofErr w:type="spellEnd"/>
+                  <w:r>
+                    <w:rPr>
+                      <w:rFonts w:ascii="Cabin" w:eastAsia="Cabin" w:hAnsi="Cabin" w:cs="Cabin"/>
+                      <w:i/>
+                      <w:sz w:val="22"/>
+                      <w:szCs w:val="22"/>
+                    </w:rPr>
+                    <w:t>05/29</w:t>
+                  </w:r>
                 </w:p>
               </w:tc>
             </w:tr>
@@ -5227,37 +5169,15 @@
                       <w:szCs w:val="22"/>
                     </w:rPr>
                   </w:pPr>
-                  <w:proofErr w:type="gramStart"/>
-                  <w:r>
-                    <w:rPr>
-                      <w:rFonts w:ascii="Cabin" w:eastAsia="Cabin" w:hAnsi="Cabin" w:cs="Cabin"/>
-                      <w:i/>
-                      <w:sz w:val="22"/>
-                      <w:szCs w:val="22"/>
-                    </w:rPr>
-                    <w:t>mm</w:t>
-                  </w:r>
-                  <w:proofErr w:type="gramEnd"/>
-                  <w:r>
-                    <w:rPr>
-                      <w:rFonts w:ascii="Cabin" w:eastAsia="Cabin" w:hAnsi="Cabin" w:cs="Cabin"/>
-                      <w:i/>
-                      <w:sz w:val="22"/>
-                      <w:szCs w:val="22"/>
-                    </w:rPr>
-                    <w:t>/</w:t>
-                  </w:r>
-                  <w:proofErr w:type="spellStart"/>
-                  <w:r>
-                    <w:rPr>
-                      <w:rFonts w:ascii="Cabin" w:eastAsia="Cabin" w:hAnsi="Cabin" w:cs="Cabin"/>
-                      <w:i/>
-                      <w:sz w:val="22"/>
-                      <w:szCs w:val="22"/>
-                    </w:rPr>
-                    <w:t>dd</w:t>
-                  </w:r>
-                  <w:proofErr w:type="spellEnd"/>
+                  <w:r>
+                    <w:rPr>
+                      <w:rFonts w:ascii="Cabin" w:eastAsia="Cabin" w:hAnsi="Cabin" w:cs="Cabin"/>
+                      <w:i/>
+                      <w:sz w:val="22"/>
+                      <w:szCs w:val="22"/>
+                    </w:rPr>
+                    <w:t>05/30</w:t>
+                  </w:r>
                 </w:p>
               </w:tc>
             </w:tr>
@@ -5490,37 +5410,15 @@
                       <w:szCs w:val="22"/>
                     </w:rPr>
                   </w:pPr>
-                  <w:proofErr w:type="gramStart"/>
-                  <w:r>
-                    <w:rPr>
-                      <w:rFonts w:ascii="Cabin" w:eastAsia="Cabin" w:hAnsi="Cabin" w:cs="Cabin"/>
-                      <w:i/>
-                      <w:sz w:val="22"/>
-                      <w:szCs w:val="22"/>
-                    </w:rPr>
-                    <w:t>mm</w:t>
-                  </w:r>
-                  <w:proofErr w:type="gramEnd"/>
-                  <w:r>
-                    <w:rPr>
-                      <w:rFonts w:ascii="Cabin" w:eastAsia="Cabin" w:hAnsi="Cabin" w:cs="Cabin"/>
-                      <w:i/>
-                      <w:sz w:val="22"/>
-                      <w:szCs w:val="22"/>
-                    </w:rPr>
-                    <w:t>/</w:t>
-                  </w:r>
-                  <w:proofErr w:type="spellStart"/>
-                  <w:r>
-                    <w:rPr>
-                      <w:rFonts w:ascii="Cabin" w:eastAsia="Cabin" w:hAnsi="Cabin" w:cs="Cabin"/>
-                      <w:i/>
-                      <w:sz w:val="22"/>
-                      <w:szCs w:val="22"/>
-                    </w:rPr>
-                    <w:t>dd</w:t>
-                  </w:r>
-                  <w:proofErr w:type="spellEnd"/>
+                  <w:r>
+                    <w:rPr>
+                      <w:rFonts w:ascii="Cabin" w:eastAsia="Cabin" w:hAnsi="Cabin" w:cs="Cabin"/>
+                      <w:i/>
+                      <w:sz w:val="22"/>
+                      <w:szCs w:val="22"/>
+                    </w:rPr>
+                    <w:t>05/31</w:t>
+                  </w:r>
                 </w:p>
               </w:tc>
             </w:tr>
@@ -5743,37 +5641,15 @@
                       <w:szCs w:val="22"/>
                     </w:rPr>
                   </w:pPr>
-                  <w:proofErr w:type="gramStart"/>
-                  <w:r>
-                    <w:rPr>
-                      <w:rFonts w:ascii="Cabin" w:eastAsia="Cabin" w:hAnsi="Cabin" w:cs="Cabin"/>
-                      <w:i/>
-                      <w:sz w:val="22"/>
-                      <w:szCs w:val="22"/>
-                    </w:rPr>
-                    <w:t>mm</w:t>
-                  </w:r>
-                  <w:proofErr w:type="gramEnd"/>
-                  <w:r>
-                    <w:rPr>
-                      <w:rFonts w:ascii="Cabin" w:eastAsia="Cabin" w:hAnsi="Cabin" w:cs="Cabin"/>
-                      <w:i/>
-                      <w:sz w:val="22"/>
-                      <w:szCs w:val="22"/>
-                    </w:rPr>
-                    <w:t>/</w:t>
-                  </w:r>
-                  <w:proofErr w:type="spellStart"/>
-                  <w:r>
-                    <w:rPr>
-                      <w:rFonts w:ascii="Cabin" w:eastAsia="Cabin" w:hAnsi="Cabin" w:cs="Cabin"/>
-                      <w:i/>
-                      <w:sz w:val="22"/>
-                      <w:szCs w:val="22"/>
-                    </w:rPr>
-                    <w:t>dd</w:t>
-                  </w:r>
-                  <w:proofErr w:type="spellEnd"/>
+                  <w:r>
+                    <w:rPr>
+                      <w:rFonts w:ascii="Cabin" w:eastAsia="Cabin" w:hAnsi="Cabin" w:cs="Cabin"/>
+                      <w:i/>
+                      <w:sz w:val="22"/>
+                      <w:szCs w:val="22"/>
+                    </w:rPr>
+                    <w:t>06/01</w:t>
+                  </w:r>
                 </w:p>
               </w:tc>
             </w:tr>
@@ -5890,7 +5766,6 @@
                       <w:color w:val="B7B7B7"/>
                       <w:sz w:val="22"/>
                       <w:szCs w:val="22"/>
-                      <w:lang w:val="en-US"/>
                     </w:rPr>
                   </w:pPr>
                 </w:p>
@@ -6163,37 +6038,15 @@
                       <w:szCs w:val="22"/>
                     </w:rPr>
                   </w:pPr>
-                  <w:proofErr w:type="gramStart"/>
-                  <w:r>
-                    <w:rPr>
-                      <w:rFonts w:ascii="Cabin" w:eastAsia="Cabin" w:hAnsi="Cabin" w:cs="Cabin"/>
-                      <w:i/>
-                      <w:sz w:val="22"/>
-                      <w:szCs w:val="22"/>
-                    </w:rPr>
-                    <w:t>mm</w:t>
-                  </w:r>
-                  <w:proofErr w:type="gramEnd"/>
-                  <w:r>
-                    <w:rPr>
-                      <w:rFonts w:ascii="Cabin" w:eastAsia="Cabin" w:hAnsi="Cabin" w:cs="Cabin"/>
-                      <w:i/>
-                      <w:sz w:val="22"/>
-                      <w:szCs w:val="22"/>
-                    </w:rPr>
-                    <w:t>/</w:t>
-                  </w:r>
-                  <w:proofErr w:type="spellStart"/>
-                  <w:r>
-                    <w:rPr>
-                      <w:rFonts w:ascii="Cabin" w:eastAsia="Cabin" w:hAnsi="Cabin" w:cs="Cabin"/>
-                      <w:i/>
-                      <w:sz w:val="22"/>
-                      <w:szCs w:val="22"/>
-                    </w:rPr>
-                    <w:t>dd</w:t>
-                  </w:r>
-                  <w:proofErr w:type="spellEnd"/>
+                  <w:r>
+                    <w:rPr>
+                      <w:rFonts w:ascii="Cabin" w:eastAsia="Cabin" w:hAnsi="Cabin" w:cs="Cabin"/>
+                      <w:i/>
+                      <w:sz w:val="22"/>
+                      <w:szCs w:val="22"/>
+                    </w:rPr>
+                    <w:t>06/01</w:t>
+                  </w:r>
                 </w:p>
               </w:tc>
             </w:tr>
@@ -6235,7 +6088,7 @@
     </w:p>
     <w:p>
       <w:pPr>
-        <w:pStyle w:val="Kop1"/>
+        <w:pStyle w:val="Heading1"/>
         <w:spacing w:before="0" w:after="60" w:line="276" w:lineRule="auto"/>
         <w:rPr>
           <w:rFonts w:ascii="Roboto Condensed" w:eastAsia="Roboto Condensed" w:hAnsi="Roboto Condensed" w:cs="Roboto Condensed"/>
@@ -7316,15 +7169,15 @@
     <w:lsdException w:name="Unresolved Mention" w:semiHidden="1" w:unhideWhenUsed="1"/>
     <w:lsdException w:name="Smart Link" w:semiHidden="1" w:unhideWhenUsed="1"/>
   </w:latentStyles>
-  <w:style w:type="paragraph" w:default="1" w:styleId="Standaard">
+  <w:style w:type="paragraph" w:default="1" w:styleId="Normal">
     <w:name w:val="Normal"/>
     <w:qFormat/>
   </w:style>
-  <w:style w:type="paragraph" w:styleId="Kop1">
+  <w:style w:type="paragraph" w:styleId="Heading1">
     <w:name w:val="heading 1"/>
-    <w:basedOn w:val="Standaard"/>
-    <w:next w:val="Standaard"/>
-    <w:link w:val="Kop1Char"/>
+    <w:basedOn w:val="Normal"/>
+    <w:next w:val="Normal"/>
+    <w:link w:val="Heading1Char"/>
     <w:uiPriority w:val="9"/>
     <w:qFormat/>
     <w:rsid w:val="00523FD1"/>
@@ -7341,11 +7194,11 @@
       <w:szCs w:val="32"/>
     </w:rPr>
   </w:style>
-  <w:style w:type="paragraph" w:styleId="Kop2">
+  <w:style w:type="paragraph" w:styleId="Heading2">
     <w:name w:val="heading 2"/>
-    <w:basedOn w:val="Standaard"/>
-    <w:next w:val="Standaard"/>
-    <w:link w:val="Kop2Char"/>
+    <w:basedOn w:val="Normal"/>
+    <w:next w:val="Normal"/>
+    <w:link w:val="Heading2Char"/>
     <w:uiPriority w:val="9"/>
     <w:unhideWhenUsed/>
     <w:qFormat/>
@@ -7363,10 +7216,10 @@
       <w:szCs w:val="26"/>
     </w:rPr>
   </w:style>
-  <w:style w:type="paragraph" w:styleId="Kop3">
+  <w:style w:type="paragraph" w:styleId="Heading3">
     <w:name w:val="heading 3"/>
-    <w:basedOn w:val="Standaard"/>
-    <w:next w:val="Standaard"/>
+    <w:basedOn w:val="Normal"/>
+    <w:next w:val="Normal"/>
     <w:uiPriority w:val="9"/>
     <w:semiHidden/>
     <w:unhideWhenUsed/>
@@ -7383,10 +7236,10 @@
       <w:szCs w:val="28"/>
     </w:rPr>
   </w:style>
-  <w:style w:type="paragraph" w:styleId="Kop4">
+  <w:style w:type="paragraph" w:styleId="Heading4">
     <w:name w:val="heading 4"/>
-    <w:basedOn w:val="Standaard"/>
-    <w:next w:val="Standaard"/>
+    <w:basedOn w:val="Normal"/>
+    <w:next w:val="Normal"/>
     <w:uiPriority w:val="9"/>
     <w:semiHidden/>
     <w:unhideWhenUsed/>
@@ -7401,10 +7254,10 @@
       <w:b/>
     </w:rPr>
   </w:style>
-  <w:style w:type="paragraph" w:styleId="Kop5">
+  <w:style w:type="paragraph" w:styleId="Heading5">
     <w:name w:val="heading 5"/>
-    <w:basedOn w:val="Standaard"/>
-    <w:next w:val="Standaard"/>
+    <w:basedOn w:val="Normal"/>
+    <w:next w:val="Normal"/>
     <w:uiPriority w:val="9"/>
     <w:semiHidden/>
     <w:unhideWhenUsed/>
@@ -7421,10 +7274,10 @@
       <w:szCs w:val="22"/>
     </w:rPr>
   </w:style>
-  <w:style w:type="paragraph" w:styleId="Kop6">
+  <w:style w:type="paragraph" w:styleId="Heading6">
     <w:name w:val="heading 6"/>
-    <w:basedOn w:val="Standaard"/>
-    <w:next w:val="Standaard"/>
+    <w:basedOn w:val="Normal"/>
+    <w:next w:val="Normal"/>
     <w:uiPriority w:val="9"/>
     <w:semiHidden/>
     <w:unhideWhenUsed/>
@@ -7441,12 +7294,13 @@
       <w:szCs w:val="20"/>
     </w:rPr>
   </w:style>
-  <w:style w:type="character" w:default="1" w:styleId="Standaardalinea-lettertype">
+  <w:style w:type="character" w:default="1" w:styleId="DefaultParagraphFont">
     <w:name w:val="Default Paragraph Font"/>
     <w:uiPriority w:val="1"/>
+    <w:semiHidden/>
     <w:unhideWhenUsed/>
   </w:style>
-  <w:style w:type="table" w:default="1" w:styleId="Standaardtabel">
+  <w:style w:type="table" w:default="1" w:styleId="TableNormal">
     <w:name w:val="Normal Table"/>
     <w:uiPriority w:val="99"/>
     <w:semiHidden/>
@@ -7461,14 +7315,14 @@
       </w:tblCellMar>
     </w:tblPr>
   </w:style>
-  <w:style w:type="numbering" w:default="1" w:styleId="Geenlijst">
+  <w:style w:type="numbering" w:default="1" w:styleId="NoList">
     <w:name w:val="No List"/>
     <w:uiPriority w:val="99"/>
     <w:semiHidden/>
     <w:unhideWhenUsed/>
   </w:style>
-  <w:style w:type="table" w:customStyle="1" w:styleId="TableNormal">
-    <w:name w:val="Table Normal"/>
+  <w:style w:type="table" w:customStyle="1" w:styleId="TableNormal1">
+    <w:name w:val="Table Normal1"/>
     <w:tblPr>
       <w:tblCellMar>
         <w:top w:w="0" w:type="dxa"/>
@@ -7478,10 +7332,10 @@
       </w:tblCellMar>
     </w:tblPr>
   </w:style>
-  <w:style w:type="paragraph" w:styleId="Titel">
+  <w:style w:type="paragraph" w:styleId="Title">
     <w:name w:val="Title"/>
-    <w:basedOn w:val="Standaard"/>
-    <w:next w:val="Standaard"/>
+    <w:basedOn w:val="Normal"/>
+    <w:next w:val="Normal"/>
     <w:uiPriority w:val="10"/>
     <w:qFormat/>
     <w:pPr>
@@ -7495,8 +7349,8 @@
       <w:szCs w:val="72"/>
     </w:rPr>
   </w:style>
-  <w:style w:type="table" w:customStyle="1" w:styleId="TableNormal0">
-    <w:name w:val="Table Normal"/>
+  <w:style w:type="table" w:customStyle="1" w:styleId="TableNormal2">
+    <w:name w:val="Table Normal2"/>
     <w:tblPr>
       <w:tblCellMar>
         <w:top w:w="0" w:type="dxa"/>
@@ -7506,9 +7360,9 @@
       </w:tblCellMar>
     </w:tblPr>
   </w:style>
-  <w:style w:type="table" w:styleId="Tabelraster">
+  <w:style w:type="table" w:styleId="TableGrid">
     <w:name w:val="Table Grid"/>
-    <w:basedOn w:val="Standaardtabel"/>
+    <w:basedOn w:val="TableNormal"/>
     <w:uiPriority w:val="39"/>
     <w:rsid w:val="00523FD1"/>
     <w:tblPr>
@@ -7522,9 +7376,9 @@
       </w:tblBorders>
     </w:tblPr>
   </w:style>
-  <w:style w:type="paragraph" w:styleId="Lijstalinea">
+  <w:style w:type="paragraph" w:styleId="ListParagraph">
     <w:name w:val="List Paragraph"/>
-    <w:basedOn w:val="Standaard"/>
+    <w:basedOn w:val="Normal"/>
     <w:uiPriority w:val="34"/>
     <w:qFormat/>
     <w:rsid w:val="00523FD1"/>
@@ -7533,10 +7387,10 @@
       <w:contextualSpacing/>
     </w:pPr>
   </w:style>
-  <w:style w:type="character" w:customStyle="1" w:styleId="Kop1Char">
-    <w:name w:val="Kop 1 Char"/>
-    <w:basedOn w:val="Standaardalinea-lettertype"/>
-    <w:link w:val="Kop1"/>
+  <w:style w:type="character" w:customStyle="1" w:styleId="Heading1Char">
+    <w:name w:val="Heading 1 Char"/>
+    <w:basedOn w:val="DefaultParagraphFont"/>
+    <w:link w:val="Heading1"/>
     <w:uiPriority w:val="9"/>
     <w:rsid w:val="00523FD1"/>
     <w:rPr>
@@ -7546,10 +7400,10 @@
       <w:szCs w:val="32"/>
     </w:rPr>
   </w:style>
-  <w:style w:type="character" w:customStyle="1" w:styleId="Kop2Char">
-    <w:name w:val="Kop 2 Char"/>
-    <w:basedOn w:val="Standaardalinea-lettertype"/>
-    <w:link w:val="Kop2"/>
+  <w:style w:type="character" w:customStyle="1" w:styleId="Heading2Char">
+    <w:name w:val="Heading 2 Char"/>
+    <w:basedOn w:val="DefaultParagraphFont"/>
+    <w:link w:val="Heading2"/>
     <w:uiPriority w:val="9"/>
     <w:rsid w:val="00523FD1"/>
     <w:rPr>
@@ -7559,10 +7413,10 @@
       <w:szCs w:val="26"/>
     </w:rPr>
   </w:style>
-  <w:style w:type="paragraph" w:styleId="Ondertitel">
+  <w:style w:type="paragraph" w:styleId="Subtitle">
     <w:name w:val="Subtitle"/>
-    <w:basedOn w:val="Standaard"/>
-    <w:next w:val="Standaard"/>
+    <w:basedOn w:val="Normal"/>
+    <w:next w:val="Normal"/>
     <w:uiPriority w:val="11"/>
     <w:qFormat/>
     <w:pPr>
@@ -7579,35 +7433,35 @@
     </w:rPr>
   </w:style>
   <w:style w:type="table" w:customStyle="1" w:styleId="a">
-    <w:basedOn w:val="Standaardtabel"/>
+    <w:basedOn w:val="TableNormal"/>
     <w:tblPr>
       <w:tblStyleRowBandSize w:val="1"/>
       <w:tblStyleColBandSize w:val="1"/>
     </w:tblPr>
   </w:style>
   <w:style w:type="table" w:customStyle="1" w:styleId="a0">
-    <w:basedOn w:val="Standaardtabel"/>
+    <w:basedOn w:val="TableNormal"/>
     <w:tblPr>
       <w:tblStyleRowBandSize w:val="1"/>
       <w:tblStyleColBandSize w:val="1"/>
     </w:tblPr>
   </w:style>
   <w:style w:type="table" w:customStyle="1" w:styleId="a1">
-    <w:basedOn w:val="Standaardtabel"/>
+    <w:basedOn w:val="TableNormal"/>
     <w:tblPr>
       <w:tblStyleRowBandSize w:val="1"/>
       <w:tblStyleColBandSize w:val="1"/>
     </w:tblPr>
   </w:style>
   <w:style w:type="table" w:customStyle="1" w:styleId="a2">
-    <w:basedOn w:val="Standaardtabel"/>
+    <w:basedOn w:val="TableNormal"/>
     <w:tblPr>
       <w:tblStyleRowBandSize w:val="1"/>
       <w:tblStyleColBandSize w:val="1"/>
     </w:tblPr>
   </w:style>
   <w:style w:type="table" w:customStyle="1" w:styleId="a3">
-    <w:basedOn w:val="Standaardtabel"/>
+    <w:basedOn w:val="TableNormal"/>
     <w:tblPr>
       <w:tblStyleRowBandSize w:val="1"/>
       <w:tblStyleColBandSize w:val="1"/>
@@ -7620,7 +7474,7 @@
     </w:tblPr>
   </w:style>
   <w:style w:type="table" w:customStyle="1" w:styleId="a4">
-    <w:basedOn w:val="Standaardtabel"/>
+    <w:basedOn w:val="TableNormal"/>
     <w:tblPr>
       <w:tblStyleRowBandSize w:val="1"/>
       <w:tblStyleColBandSize w:val="1"/>
@@ -7633,7 +7487,7 @@
     </w:tblPr>
   </w:style>
   <w:style w:type="table" w:customStyle="1" w:styleId="a5">
-    <w:basedOn w:val="Standaardtabel"/>
+    <w:basedOn w:val="TableNormal"/>
     <w:tblPr>
       <w:tblStyleRowBandSize w:val="1"/>
       <w:tblStyleColBandSize w:val="1"/>
@@ -7646,7 +7500,7 @@
     </w:tblPr>
   </w:style>
   <w:style w:type="table" w:customStyle="1" w:styleId="a6">
-    <w:basedOn w:val="Standaardtabel"/>
+    <w:basedOn w:val="TableNormal"/>
     <w:tblPr>
       <w:tblStyleRowBandSize w:val="1"/>
       <w:tblStyleColBandSize w:val="1"/>
@@ -7659,7 +7513,7 @@
     </w:tblPr>
   </w:style>
   <w:style w:type="table" w:customStyle="1" w:styleId="a7">
-    <w:basedOn w:val="Standaardtabel"/>
+    <w:basedOn w:val="TableNormal"/>
     <w:tblPr>
       <w:tblStyleRowBandSize w:val="1"/>
       <w:tblStyleColBandSize w:val="1"/>
@@ -7672,7 +7526,7 @@
     </w:tblPr>
   </w:style>
   <w:style w:type="table" w:customStyle="1" w:styleId="a8">
-    <w:basedOn w:val="Standaardtabel"/>
+    <w:basedOn w:val="TableNormal"/>
     <w:tblPr>
       <w:tblStyleRowBandSize w:val="1"/>
       <w:tblStyleColBandSize w:val="1"/>
@@ -7685,7 +7539,7 @@
     </w:tblPr>
   </w:style>
   <w:style w:type="table" w:customStyle="1" w:styleId="a9">
-    <w:basedOn w:val="Standaardtabel"/>
+    <w:basedOn w:val="TableNormal"/>
     <w:tblPr>
       <w:tblStyleRowBandSize w:val="1"/>
       <w:tblStyleColBandSize w:val="1"/>
@@ -7698,7 +7552,7 @@
     </w:tblPr>
   </w:style>
   <w:style w:type="table" w:customStyle="1" w:styleId="aa">
-    <w:basedOn w:val="Standaardtabel"/>
+    <w:basedOn w:val="TableNormal"/>
     <w:tblPr>
       <w:tblStyleRowBandSize w:val="1"/>
       <w:tblStyleColBandSize w:val="1"/>
@@ -7711,7 +7565,7 @@
     </w:tblPr>
   </w:style>
   <w:style w:type="table" w:customStyle="1" w:styleId="ab">
-    <w:basedOn w:val="Standaardtabel"/>
+    <w:basedOn w:val="TableNormal"/>
     <w:tblPr>
       <w:tblStyleRowBandSize w:val="1"/>
       <w:tblStyleColBandSize w:val="1"/>
@@ -7724,7 +7578,7 @@
     </w:tblPr>
   </w:style>
   <w:style w:type="table" w:customStyle="1" w:styleId="ac">
-    <w:basedOn w:val="Standaardtabel"/>
+    <w:basedOn w:val="TableNormal"/>
     <w:tblPr>
       <w:tblStyleRowBandSize w:val="1"/>
       <w:tblStyleColBandSize w:val="1"/>
@@ -7737,7 +7591,7 @@
     </w:tblPr>
   </w:style>
   <w:style w:type="table" w:customStyle="1" w:styleId="ad">
-    <w:basedOn w:val="Standaardtabel"/>
+    <w:basedOn w:val="TableNormal"/>
     <w:tblPr>
       <w:tblStyleRowBandSize w:val="1"/>
       <w:tblStyleColBandSize w:val="1"/>
@@ -7750,7 +7604,7 @@
     </w:tblPr>
   </w:style>
   <w:style w:type="table" w:customStyle="1" w:styleId="ae">
-    <w:basedOn w:val="Standaardtabel"/>
+    <w:basedOn w:val="TableNormal"/>
     <w:tblPr>
       <w:tblStyleRowBandSize w:val="1"/>
       <w:tblStyleColBandSize w:val="1"/>
@@ -7763,7 +7617,7 @@
     </w:tblPr>
   </w:style>
   <w:style w:type="table" w:customStyle="1" w:styleId="af">
-    <w:basedOn w:val="Standaardtabel"/>
+    <w:basedOn w:val="TableNormal"/>
     <w:tblPr>
       <w:tblStyleRowBandSize w:val="1"/>
       <w:tblStyleColBandSize w:val="1"/>
@@ -7776,7 +7630,7 @@
     </w:tblPr>
   </w:style>
   <w:style w:type="table" w:customStyle="1" w:styleId="af0">
-    <w:basedOn w:val="Standaardtabel"/>
+    <w:basedOn w:val="TableNormal"/>
     <w:tblPr>
       <w:tblStyleRowBandSize w:val="1"/>
       <w:tblStyleColBandSize w:val="1"/>
@@ -7789,7 +7643,7 @@
     </w:tblPr>
   </w:style>
   <w:style w:type="table" w:customStyle="1" w:styleId="af1">
-    <w:basedOn w:val="Standaardtabel"/>
+    <w:basedOn w:val="TableNormal"/>
     <w:tblPr>
       <w:tblStyleRowBandSize w:val="1"/>
       <w:tblStyleColBandSize w:val="1"/>
@@ -7802,7 +7656,7 @@
     </w:tblPr>
   </w:style>
   <w:style w:type="table" w:customStyle="1" w:styleId="af2">
-    <w:basedOn w:val="Standaardtabel"/>
+    <w:basedOn w:val="TableNormal"/>
     <w:tblPr>
       <w:tblStyleRowBandSize w:val="1"/>
       <w:tblStyleColBandSize w:val="1"/>
@@ -7815,7 +7669,7 @@
     </w:tblPr>
   </w:style>
   <w:style w:type="table" w:customStyle="1" w:styleId="af3">
-    <w:basedOn w:val="Standaardtabel"/>
+    <w:basedOn w:val="TableNormal"/>
     <w:tblPr>
       <w:tblStyleRowBandSize w:val="1"/>
       <w:tblStyleColBandSize w:val="1"/>
@@ -7828,7 +7682,7 @@
     </w:tblPr>
   </w:style>
   <w:style w:type="table" w:customStyle="1" w:styleId="af4">
-    <w:basedOn w:val="Standaardtabel"/>
+    <w:basedOn w:val="TableNormal"/>
     <w:tblPr>
       <w:tblStyleRowBandSize w:val="1"/>
       <w:tblStyleColBandSize w:val="1"/>
@@ -7841,7 +7695,7 @@
     </w:tblPr>
   </w:style>
   <w:style w:type="table" w:customStyle="1" w:styleId="af5">
-    <w:basedOn w:val="Standaardtabel"/>
+    <w:basedOn w:val="TableNormal"/>
     <w:tblPr>
       <w:tblStyleRowBandSize w:val="1"/>
       <w:tblStyleColBandSize w:val="1"/>
@@ -7854,7 +7708,7 @@
     </w:tblPr>
   </w:style>
   <w:style w:type="table" w:customStyle="1" w:styleId="af6">
-    <w:basedOn w:val="Standaardtabel"/>
+    <w:basedOn w:val="TableNormal"/>
     <w:tblPr>
       <w:tblStyleRowBandSize w:val="1"/>
       <w:tblStyleColBandSize w:val="1"/>
@@ -7867,7 +7721,7 @@
     </w:tblPr>
   </w:style>
   <w:style w:type="table" w:customStyle="1" w:styleId="af7">
-    <w:basedOn w:val="Standaardtabel"/>
+    <w:basedOn w:val="TableNormal"/>
     <w:tblPr>
       <w:tblStyleRowBandSize w:val="1"/>
       <w:tblStyleColBandSize w:val="1"/>
@@ -7880,7 +7734,7 @@
     </w:tblPr>
   </w:style>
   <w:style w:type="table" w:customStyle="1" w:styleId="af8">
-    <w:basedOn w:val="Standaardtabel"/>
+    <w:basedOn w:val="TableNormal"/>
     <w:tblPr>
       <w:tblStyleRowBandSize w:val="1"/>
       <w:tblStyleColBandSize w:val="1"/>
@@ -7893,7 +7747,7 @@
     </w:tblPr>
   </w:style>
   <w:style w:type="table" w:customStyle="1" w:styleId="af9">
-    <w:basedOn w:val="Standaardtabel"/>
+    <w:basedOn w:val="TableNormal"/>
     <w:tblPr>
       <w:tblStyleRowBandSize w:val="1"/>
       <w:tblStyleColBandSize w:val="1"/>
@@ -7906,7 +7760,7 @@
     </w:tblPr>
   </w:style>
   <w:style w:type="table" w:customStyle="1" w:styleId="afa">
-    <w:basedOn w:val="Standaardtabel"/>
+    <w:basedOn w:val="TableNormal"/>
     <w:tblPr>
       <w:tblStyleRowBandSize w:val="1"/>
       <w:tblStyleColBandSize w:val="1"/>
@@ -7919,7 +7773,7 @@
     </w:tblPr>
   </w:style>
   <w:style w:type="table" w:customStyle="1" w:styleId="afb">
-    <w:basedOn w:val="Standaardtabel"/>
+    <w:basedOn w:val="TableNormal"/>
     <w:tblPr>
       <w:tblStyleRowBandSize w:val="1"/>
       <w:tblStyleColBandSize w:val="1"/>
@@ -7932,7 +7786,7 @@
     </w:tblPr>
   </w:style>
   <w:style w:type="table" w:customStyle="1" w:styleId="afc">
-    <w:basedOn w:val="Standaardtabel"/>
+    <w:basedOn w:val="TableNormal"/>
     <w:tblPr>
       <w:tblStyleRowBandSize w:val="1"/>
       <w:tblStyleColBandSize w:val="1"/>
@@ -7945,7 +7799,7 @@
     </w:tblPr>
   </w:style>
   <w:style w:type="table" w:customStyle="1" w:styleId="afd">
-    <w:basedOn w:val="Standaardtabel"/>
+    <w:basedOn w:val="TableNormal"/>
     <w:tblPr>
       <w:tblStyleRowBandSize w:val="1"/>
       <w:tblStyleColBandSize w:val="1"/>
@@ -7958,7 +7812,7 @@
     </w:tblPr>
   </w:style>
   <w:style w:type="table" w:customStyle="1" w:styleId="afe">
-    <w:basedOn w:val="Standaardtabel"/>
+    <w:basedOn w:val="TableNormal"/>
     <w:tblPr>
       <w:tblStyleRowBandSize w:val="1"/>
       <w:tblStyleColBandSize w:val="1"/>
@@ -7971,7 +7825,7 @@
     </w:tblPr>
   </w:style>
   <w:style w:type="table" w:customStyle="1" w:styleId="aff">
-    <w:basedOn w:val="Standaardtabel"/>
+    <w:basedOn w:val="TableNormal"/>
     <w:tblPr>
       <w:tblStyleRowBandSize w:val="1"/>
       <w:tblStyleColBandSize w:val="1"/>
@@ -7984,7 +7838,7 @@
     </w:tblPr>
   </w:style>
   <w:style w:type="table" w:customStyle="1" w:styleId="aff0">
-    <w:basedOn w:val="Standaardtabel"/>
+    <w:basedOn w:val="TableNormal"/>
     <w:tblPr>
       <w:tblStyleRowBandSize w:val="1"/>
       <w:tblStyleColBandSize w:val="1"/>
@@ -7997,7 +7851,7 @@
     </w:tblPr>
   </w:style>
   <w:style w:type="table" w:customStyle="1" w:styleId="aff1">
-    <w:basedOn w:val="Standaardtabel"/>
+    <w:basedOn w:val="TableNormal"/>
     <w:tblPr>
       <w:tblStyleRowBandSize w:val="1"/>
       <w:tblStyleColBandSize w:val="1"/>
@@ -8010,7 +7864,7 @@
     </w:tblPr>
   </w:style>
   <w:style w:type="table" w:customStyle="1" w:styleId="aff2">
-    <w:basedOn w:val="Standaardtabel"/>
+    <w:basedOn w:val="TableNormal"/>
     <w:tblPr>
       <w:tblStyleRowBandSize w:val="1"/>
       <w:tblStyleColBandSize w:val="1"/>
@@ -8023,7 +7877,7 @@
     </w:tblPr>
   </w:style>
   <w:style w:type="table" w:customStyle="1" w:styleId="aff3">
-    <w:basedOn w:val="Standaardtabel"/>
+    <w:basedOn w:val="TableNormal"/>
     <w:tblPr>
       <w:tblStyleRowBandSize w:val="1"/>
       <w:tblStyleColBandSize w:val="1"/>
@@ -8036,7 +7890,7 @@
     </w:tblPr>
   </w:style>
   <w:style w:type="table" w:customStyle="1" w:styleId="aff4">
-    <w:basedOn w:val="Standaardtabel"/>
+    <w:basedOn w:val="TableNormal"/>
     <w:tblPr>
       <w:tblStyleRowBandSize w:val="1"/>
       <w:tblStyleColBandSize w:val="1"/>
@@ -8049,7 +7903,7 @@
     </w:tblPr>
   </w:style>
   <w:style w:type="table" w:customStyle="1" w:styleId="aff5">
-    <w:basedOn w:val="Standaardtabel"/>
+    <w:basedOn w:val="TableNormal"/>
     <w:tblPr>
       <w:tblStyleRowBandSize w:val="1"/>
       <w:tblStyleColBandSize w:val="1"/>
@@ -8062,7 +7916,7 @@
     </w:tblPr>
   </w:style>
   <w:style w:type="table" w:customStyle="1" w:styleId="aff6">
-    <w:basedOn w:val="Standaardtabel"/>
+    <w:basedOn w:val="TableNormal"/>
     <w:tblPr>
       <w:tblStyleRowBandSize w:val="1"/>
       <w:tblStyleColBandSize w:val="1"/>
@@ -8075,7 +7929,7 @@
     </w:tblPr>
   </w:style>
   <w:style w:type="table" w:customStyle="1" w:styleId="aff7">
-    <w:basedOn w:val="Standaardtabel"/>
+    <w:basedOn w:val="TableNormal"/>
     <w:tblPr>
       <w:tblStyleRowBandSize w:val="1"/>
       <w:tblStyleColBandSize w:val="1"/>
@@ -8088,7 +7942,7 @@
     </w:tblPr>
   </w:style>
   <w:style w:type="table" w:customStyle="1" w:styleId="aff8">
-    <w:basedOn w:val="Standaardtabel"/>
+    <w:basedOn w:val="TableNormal"/>
     <w:tblPr>
       <w:tblStyleRowBandSize w:val="1"/>
       <w:tblStyleColBandSize w:val="1"/>

</xml_diff>